<commit_message>
Guide: nightly timeline, how things sync, group chat bookings doc
New sections: a night step by step (cloud), how the sheet, bot,
Status tab, bookings doc and GitHub stay in sync, and the Gemini-fed
bookings doc pinned in the group chat (Status columns, filter rules,
what it can't see). Also corrects the order options are tried in:
every time in the first room before the next room.

Co-Authored-By: Claude Opus 5.5 <noreply@anthropic.com>
Claude-Session: https://claude.ai/code/session_013Zbb6i1rwwoij3EYkDMqKx
</commit_message>
<xml_diff>
--- a/docs/Canal-Booker-Guide.docx
+++ b/docs/Canal-Booker-Guide.docx
@@ -95,7 +95,7 @@
             <w:r>
               <w:t xml:space="preserve">add your rows to the </w:t>
             </w:r>
-            <w:hyperlink w:history="1" r:id="rIdkm4govx69kanzo6di0fcf">
+            <w:hyperlink w:history="1" r:id="rIdk1a7mjewuzhkhf-injakw">
               <w:r>
                 <w:rPr>
                   <w:rStyle w:val="Hyperlink"/>
@@ -283,7 +283,7 @@
             </w:tcMar>
           </w:tcPr>
           <w:p>
-            <w:hyperlink w:history="1" r:id="rId2py2rjkj0ugaolrbpcvba">
+            <w:hyperlink w:history="1" r:id="rIds-a9crzcutnfnc7n6mvqk">
               <w:r>
                 <w:rPr>
                   <w:rStyle w:val="Hyperlink"/>
@@ -391,7 +391,7 @@
             </w:tcMar>
           </w:tcPr>
           <w:p>
-            <w:hyperlink w:history="1" r:id="rId4tj5aiq_sttpya6eerj3v">
+            <w:hyperlink w:history="1" r:id="rIda1vmu-rktuqzt-mn04dvm">
               <w:r>
                 <w:rPr>
                   <w:rStyle w:val="Hyperlink"/>
@@ -449,7 +449,7 @@
             </w:tcMar>
           </w:tcPr>
           <w:p>
-            <w:hyperlink w:history="1" r:id="rIdeeyeje22oegndqrgic_n7">
+            <w:hyperlink w:history="1" r:id="rIdh83upuzcpylpj7tztwbon">
               <w:r>
                 <w:rPr>
                   <w:rStyle w:val="Hyperlink"/>
@@ -507,7 +507,7 @@
             </w:tcMar>
           </w:tcPr>
           <w:p>
-            <w:hyperlink w:history="1" r:id="rIdrejdfqrvzzcyw5ztk-kyp">
+            <w:hyperlink w:history="1" r:id="rIdzisfopi0eycqbigjoqdu0">
               <w:r>
                 <w:rPr>
                   <w:rStyle w:val="Hyperlink"/>
@@ -544,6 +544,56 @@
                 <w:b/>
                 <w:bCs/>
               </w:rPr>
+              <w:t xml:space="preserve">Bookings doc</w:t>
+            </w:r>
+          </w:p>
+        </w:tc>
+        <w:tc>
+          <w:tcPr>
+            <w:tcW w:type="dxa" w:w="6760"/>
+            <w:tcBorders>
+              <w:top w:val="single" w:color="B4C6DC" w:sz="4"/>
+              <w:left w:val="single" w:color="B4C6DC" w:sz="4"/>
+              <w:bottom w:val="single" w:color="B4C6DC" w:sz="4"/>
+              <w:right w:val="single" w:color="B4C6DC" w:sz="4"/>
+            </w:tcBorders>
+            <w:tcMar>
+              <w:top w:type="dxa" w:w="80"/>
+              <w:left w:type="dxa" w:w="120"/>
+              <w:bottom w:type="dxa" w:w="80"/>
+              <w:right w:type="dxa" w:w="120"/>
+            </w:tcMar>
+          </w:tcPr>
+          <w:p>
+            <w:r>
+              <w:t xml:space="preserve">The Google Doc pinned in the group chat. Lists who has which room, updated each morning from the Status tab (section 9).</w:t>
+            </w:r>
+          </w:p>
+        </w:tc>
+      </w:tr>
+      <w:tr>
+        <w:tc>
+          <w:tcPr>
+            <w:tcW w:type="dxa" w:w="2600"/>
+            <w:tcBorders>
+              <w:top w:val="single" w:color="B4C6DC" w:sz="4"/>
+              <w:left w:val="single" w:color="B4C6DC" w:sz="4"/>
+              <w:bottom w:val="single" w:color="B4C6DC" w:sz="4"/>
+              <w:right w:val="single" w:color="B4C6DC" w:sz="4"/>
+            </w:tcBorders>
+            <w:tcMar>
+              <w:top w:type="dxa" w:w="80"/>
+              <w:left w:type="dxa" w:w="120"/>
+              <w:bottom w:type="dxa" w:w="80"/>
+              <w:right w:type="dxa" w:w="120"/>
+            </w:tcMar>
+          </w:tcPr>
+          <w:p>
+            <w:r>
+              <w:rPr>
+                <w:b/>
+                <w:bCs/>
+              </w:rPr>
               <w:t xml:space="preserve">Booking portal</w:t>
             </w:r>
           </w:p>
@@ -565,7 +615,7 @@
             </w:tcMar>
           </w:tcPr>
           <w:p>
-            <w:hyperlink w:history="1" r:id="rIdm1uuy85r_kp3vfsibhglr">
+            <w:hyperlink w:history="1" r:id="rIdzmn0tavj2nkmxzgxqizab">
               <w:r>
                 <w:rPr>
                   <w:rStyle w:val="Hyperlink"/>
@@ -746,7 +796,7 @@
         <w:spacing w:after="120"/>
       </w:pPr>
       <w:r>
-        <w:t xml:space="preserve">One booking per person per day. Your main time is tried first, then your backup times, in each room in the order you listed them.</w:t>
+        <w:t xml:space="preserve">One booking per person per day. In your first room it tries your main time, then your backup times; only then does it move to your next room with the same times.</w:t>
       </w:r>
     </w:p>
     <w:p>
@@ -764,7 +814,7 @@
       <w:r>
         <w:t xml:space="preserve">Open the </w:t>
       </w:r>
-      <w:hyperlink w:history="1" r:id="rIdebb35bsvhcuskd8c4ejo4">
+      <w:hyperlink w:history="1" r:id="rIdhxmcfv2gsvbrpayr-lm5-">
         <w:r>
           <w:rPr>
             <w:rStyle w:val="Hyperlink"/>
@@ -2103,7 +2153,7 @@
       <w:r>
         <w:t xml:space="preserve">Open </w:t>
       </w:r>
-      <w:hyperlink w:history="1" r:id="rId6okb_5avcqig28dy6cjru">
+      <w:hyperlink w:history="1" r:id="rId8vsvdjsfgi9fibru-k6qw">
         <w:r>
           <w:rPr>
             <w:rStyle w:val="Hyperlink"/>
@@ -2328,7 +2378,7 @@
       <w:r>
         <w:t xml:space="preserve">Go to </w:t>
       </w:r>
-      <w:hyperlink w:history="1" r:id="rIdrqaws6oib4k3dbklwpyj2">
+      <w:hyperlink w:history="1" r:id="rIdhonylzcjgzcfxosxak0hv">
         <w:r>
           <w:rPr>
             <w:rStyle w:val="Hyperlink"/>
@@ -2921,7 +2971,7 @@
       <w:r>
         <w:t xml:space="preserve">The portal's </w:t>
       </w:r>
-      <w:hyperlink w:history="1" r:id="rIdt8bbbmkeu7uidqqyq0any">
+      <w:hyperlink w:history="1" r:id="rIdqh-1zwdt0aadnzm5czpps">
         <w:r>
           <w:rPr>
             <w:rStyle w:val="Hyperlink"/>
@@ -3321,7 +3371,1276 @@
         <w:pStyle w:val="Heading1"/>
       </w:pPr>
       <w:r>
-        <w:t xml:space="preserve">7. Features at a glance</w:t>
+        <w:t xml:space="preserve">7. A night, step by step (cloud)</w:t>
+      </w:r>
+    </w:p>
+    <w:p>
+      <w:pPr>
+        <w:spacing w:after="120"/>
+      </w:pPr>
+      <w:r>
+        <w:t xml:space="preserve">All times are Ottawa time. Example: on the night of Thursday Oct 1, midnight opens </w:t>
+      </w:r>
+      <w:r>
+        <w:rPr>
+          <w:b/>
+          <w:bCs/>
+        </w:rPr>
+        <w:t xml:space="preserve">Friday Oct 9</w:t>
+      </w:r>
+      <w:r>
+        <w:t xml:space="preserve">, so the bot books your Friday row.</w:t>
+      </w:r>
+    </w:p>
+    <w:tbl>
+      <w:tblPr>
+        <w:tblW w:type="dxa" w:w="9360"/>
+        <w:tblBorders>
+          <w:top w:val="single" w:color="auto" w:sz="4"/>
+          <w:left w:val="single" w:color="auto" w:sz="4"/>
+          <w:bottom w:val="single" w:color="auto" w:sz="4"/>
+          <w:right w:val="single" w:color="auto" w:sz="4"/>
+          <w:insideH w:val="single" w:color="auto" w:sz="4"/>
+          <w:insideV w:val="single" w:color="auto" w:sz="4"/>
+        </w:tblBorders>
+      </w:tblPr>
+      <w:tblGrid>
+        <w:gridCol w:w="1900"/>
+        <w:gridCol w:w="7460"/>
+      </w:tblGrid>
+      <w:tr>
+        <w:trPr>
+          <w:tblHeader/>
+        </w:trPr>
+        <w:tc>
+          <w:tcPr>
+            <w:tcW w:type="dxa" w:w="1900"/>
+            <w:tcBorders>
+              <w:top w:val="single" w:color="B4C6DC" w:sz="4"/>
+              <w:left w:val="single" w:color="B4C6DC" w:sz="4"/>
+              <w:bottom w:val="single" w:color="B4C6DC" w:sz="4"/>
+              <w:right w:val="single" w:color="B4C6DC" w:sz="4"/>
+            </w:tcBorders>
+            <w:shd w:fill="1F4E79" w:color="auto" w:val="clear"/>
+            <w:tcMar>
+              <w:top w:type="dxa" w:w="80"/>
+              <w:left w:type="dxa" w:w="120"/>
+              <w:bottom w:type="dxa" w:w="80"/>
+              <w:right w:type="dxa" w:w="120"/>
+            </w:tcMar>
+          </w:tcPr>
+          <w:p>
+            <w:r>
+              <w:rPr>
+                <w:b/>
+                <w:bCs/>
+                <w:color w:val="FFFFFF"/>
+              </w:rPr>
+              <w:t xml:space="preserve">When</w:t>
+            </w:r>
+          </w:p>
+        </w:tc>
+        <w:tc>
+          <w:tcPr>
+            <w:tcW w:type="dxa" w:w="7460"/>
+            <w:tcBorders>
+              <w:top w:val="single" w:color="B4C6DC" w:sz="4"/>
+              <w:left w:val="single" w:color="B4C6DC" w:sz="4"/>
+              <w:bottom w:val="single" w:color="B4C6DC" w:sz="4"/>
+              <w:right w:val="single" w:color="B4C6DC" w:sz="4"/>
+            </w:tcBorders>
+            <w:shd w:fill="1F4E79" w:color="auto" w:val="clear"/>
+            <w:tcMar>
+              <w:top w:type="dxa" w:w="80"/>
+              <w:left w:type="dxa" w:w="120"/>
+              <w:bottom w:type="dxa" w:w="80"/>
+              <w:right w:type="dxa" w:w="120"/>
+            </w:tcMar>
+          </w:tcPr>
+          <w:p>
+            <w:r>
+              <w:rPr>
+                <w:b/>
+                <w:bCs/>
+                <w:color w:val="FFFFFF"/>
+              </w:rPr>
+              <w:t xml:space="preserve">What happens</w:t>
+            </w:r>
+          </w:p>
+        </w:tc>
+      </w:tr>
+      <w:tr>
+        <w:tc>
+          <w:tcPr>
+            <w:tcW w:type="dxa" w:w="1900"/>
+            <w:tcBorders>
+              <w:top w:val="single" w:color="B4C6DC" w:sz="4"/>
+              <w:left w:val="single" w:color="B4C6DC" w:sz="4"/>
+              <w:bottom w:val="single" w:color="B4C6DC" w:sz="4"/>
+              <w:right w:val="single" w:color="B4C6DC" w:sz="4"/>
+            </w:tcBorders>
+            <w:tcMar>
+              <w:top w:type="dxa" w:w="80"/>
+              <w:left w:type="dxa" w:w="120"/>
+              <w:bottom w:type="dxa" w:w="80"/>
+              <w:right w:type="dxa" w:w="120"/>
+            </w:tcMar>
+          </w:tcPr>
+          <w:p>
+            <w:r>
+              <w:t xml:space="preserve">7:17 to 11:17 pm</w:t>
+            </w:r>
+          </w:p>
+        </w:tc>
+        <w:tc>
+          <w:tcPr>
+            <w:tcW w:type="dxa" w:w="7460"/>
+            <w:tcBorders>
+              <w:top w:val="single" w:color="B4C6DC" w:sz="4"/>
+              <w:left w:val="single" w:color="B4C6DC" w:sz="4"/>
+              <w:bottom w:val="single" w:color="B4C6DC" w:sz="4"/>
+              <w:right w:val="single" w:color="B4C6DC" w:sz="4"/>
+            </w:tcBorders>
+            <w:tcMar>
+              <w:top w:type="dxa" w:w="80"/>
+              <w:left w:type="dxa" w:w="120"/>
+              <w:bottom w:type="dxa" w:w="80"/>
+              <w:right w:type="dxa" w:w="120"/>
+            </w:tcMar>
+          </w:tcPr>
+          <w:p>
+            <w:r>
+              <w:t xml:space="preserve">GitHub is scheduled to start the job five times, one hour apart. It often starts late or skips some (on Oct 1 the first start came at 10:18 pm), so there are several chances.</w:t>
+            </w:r>
+          </w:p>
+        </w:tc>
+      </w:tr>
+      <w:tr>
+        <w:tc>
+          <w:tcPr>
+            <w:tcW w:type="dxa" w:w="1900"/>
+            <w:tcBorders>
+              <w:top w:val="single" w:color="B4C6DC" w:sz="4"/>
+              <w:left w:val="single" w:color="B4C6DC" w:sz="4"/>
+              <w:bottom w:val="single" w:color="B4C6DC" w:sz="4"/>
+              <w:right w:val="single" w:color="B4C6DC" w:sz="4"/>
+            </w:tcBorders>
+            <w:tcMar>
+              <w:top w:type="dxa" w:w="80"/>
+              <w:left w:type="dxa" w:w="120"/>
+              <w:bottom w:type="dxa" w:w="80"/>
+              <w:right w:type="dxa" w:w="120"/>
+            </w:tcMar>
+          </w:tcPr>
+          <w:p>
+            <w:r>
+              <w:t xml:space="preserve">First start</w:t>
+            </w:r>
+          </w:p>
+        </w:tc>
+        <w:tc>
+          <w:tcPr>
+            <w:tcW w:type="dxa" w:w="7460"/>
+            <w:tcBorders>
+              <w:top w:val="single" w:color="B4C6DC" w:sz="4"/>
+              <w:left w:val="single" w:color="B4C6DC" w:sz="4"/>
+              <w:bottom w:val="single" w:color="B4C6DC" w:sz="4"/>
+              <w:right w:val="single" w:color="B4C6DC" w:sz="4"/>
+            </w:tcBorders>
+            <w:tcMar>
+              <w:top w:type="dxa" w:w="80"/>
+              <w:left w:type="dxa" w:w="120"/>
+              <w:bottom w:type="dxa" w:w="80"/>
+              <w:right w:type="dxa" w:w="120"/>
+            </w:tcMar>
+          </w:tcPr>
+          <w:p>
+            <w:r>
+              <w:t xml:space="preserve">About 10 seconds of setup: loads the latest code, installs the browser driver, uses the Chrome already on GitHub's machine.</w:t>
+            </w:r>
+          </w:p>
+        </w:tc>
+      </w:tr>
+      <w:tr>
+        <w:tc>
+          <w:tcPr>
+            <w:tcW w:type="dxa" w:w="1900"/>
+            <w:tcBorders>
+              <w:top w:val="single" w:color="B4C6DC" w:sz="4"/>
+              <w:left w:val="single" w:color="B4C6DC" w:sz="4"/>
+              <w:bottom w:val="single" w:color="B4C6DC" w:sz="4"/>
+              <w:right w:val="single" w:color="B4C6DC" w:sz="4"/>
+            </w:tcBorders>
+            <w:tcMar>
+              <w:top w:type="dxa" w:w="80"/>
+              <w:left w:type="dxa" w:w="120"/>
+              <w:bottom w:type="dxa" w:w="80"/>
+              <w:right w:type="dxa" w:w="120"/>
+            </w:tcMar>
+          </w:tcPr>
+          <w:p>
+            <w:r>
+              <w:t xml:space="preserve">Right after</w:t>
+            </w:r>
+          </w:p>
+        </w:tc>
+        <w:tc>
+          <w:tcPr>
+            <w:tcW w:type="dxa" w:w="7460"/>
+            <w:tcBorders>
+              <w:top w:val="single" w:color="B4C6DC" w:sz="4"/>
+              <w:left w:val="single" w:color="B4C6DC" w:sz="4"/>
+              <w:bottom w:val="single" w:color="B4C6DC" w:sz="4"/>
+              <w:right w:val="single" w:color="B4C6DC" w:sz="4"/>
+            </w:tcBorders>
+            <w:tcMar>
+              <w:top w:type="dxa" w:w="80"/>
+              <w:left w:type="dxa" w:w="120"/>
+              <w:bottom w:type="dxa" w:w="80"/>
+              <w:right w:type="dxa" w:w="120"/>
+            </w:tcMar>
+          </w:tcPr>
+          <w:p>
+            <w:r>
+              <w:t xml:space="preserve">Reads your username and password (encrypted secrets), the sheet and Status links, the newest booking steps, and your rows in the team sheet. Works out the day that opens at midnight and your row for it.</w:t>
+            </w:r>
+          </w:p>
+        </w:tc>
+      </w:tr>
+      <w:tr>
+        <w:tc>
+          <w:tcPr>
+            <w:tcW w:type="dxa" w:w="1900"/>
+            <w:tcBorders>
+              <w:top w:val="single" w:color="B4C6DC" w:sz="4"/>
+              <w:left w:val="single" w:color="B4C6DC" w:sz="4"/>
+              <w:bottom w:val="single" w:color="B4C6DC" w:sz="4"/>
+              <w:right w:val="single" w:color="B4C6DC" w:sz="4"/>
+            </w:tcBorders>
+            <w:tcMar>
+              <w:top w:type="dxa" w:w="80"/>
+              <w:left w:type="dxa" w:w="120"/>
+              <w:bottom w:type="dxa" w:w="80"/>
+              <w:right w:type="dxa" w:w="120"/>
+            </w:tcMar>
+          </w:tcPr>
+          <w:p>
+            <w:r>
+              <w:t xml:space="preserve">Until 11:57:30 pm</w:t>
+            </w:r>
+          </w:p>
+        </w:tc>
+        <w:tc>
+          <w:tcPr>
+            <w:tcW w:type="dxa" w:w="7460"/>
+            <w:tcBorders>
+              <w:top w:val="single" w:color="B4C6DC" w:sz="4"/>
+              <w:left w:val="single" w:color="B4C6DC" w:sz="4"/>
+              <w:bottom w:val="single" w:color="B4C6DC" w:sz="4"/>
+              <w:right w:val="single" w:color="B4C6DC" w:sz="4"/>
+            </w:tcBorders>
+            <w:tcMar>
+              <w:top w:type="dxa" w:w="80"/>
+              <w:left w:type="dxa" w:w="120"/>
+              <w:bottom w:type="dxa" w:w="80"/>
+              <w:right w:type="dxa" w:w="120"/>
+            </w:tcMar>
+          </w:tcPr>
+          <w:p>
+            <w:r>
+              <w:t xml:space="preserve">Waits. A cloud job may run for up to 6 hours, so an early start is fine.</w:t>
+            </w:r>
+          </w:p>
+        </w:tc>
+      </w:tr>
+      <w:tr>
+        <w:tc>
+          <w:tcPr>
+            <w:tcW w:type="dxa" w:w="1900"/>
+            <w:tcBorders>
+              <w:top w:val="single" w:color="B4C6DC" w:sz="4"/>
+              <w:left w:val="single" w:color="B4C6DC" w:sz="4"/>
+              <w:bottom w:val="single" w:color="B4C6DC" w:sz="4"/>
+              <w:right w:val="single" w:color="B4C6DC" w:sz="4"/>
+            </w:tcBorders>
+            <w:tcMar>
+              <w:top w:type="dxa" w:w="80"/>
+              <w:left w:type="dxa" w:w="120"/>
+              <w:bottom w:type="dxa" w:w="80"/>
+              <w:right w:type="dxa" w:w="120"/>
+            </w:tcMar>
+          </w:tcPr>
+          <w:p>
+            <w:r>
+              <w:t xml:space="preserve">11:57:30 pm</w:t>
+            </w:r>
+          </w:p>
+        </w:tc>
+        <w:tc>
+          <w:tcPr>
+            <w:tcW w:type="dxa" w:w="7460"/>
+            <w:tcBorders>
+              <w:top w:val="single" w:color="B4C6DC" w:sz="4"/>
+              <w:left w:val="single" w:color="B4C6DC" w:sz="4"/>
+              <w:bottom w:val="single" w:color="B4C6DC" w:sz="4"/>
+              <w:right w:val="single" w:color="B4C6DC" w:sz="4"/>
+            </w:tcBorders>
+            <w:tcMar>
+              <w:top w:type="dxa" w:w="80"/>
+              <w:left w:type="dxa" w:w="120"/>
+              <w:bottom w:type="dxa" w:w="80"/>
+              <w:right w:type="dxa" w:w="120"/>
+            </w:tcMar>
+          </w:tcPr>
+          <w:p>
+            <w:r>
+              <w:t xml:space="preserve">Reads the sheet again, so edits made up to now still count. Signs in, reads the portal's clock and fills in up to 6 tabs (each of your times in your first room, then each in your second room).</w:t>
+            </w:r>
+          </w:p>
+        </w:tc>
+      </w:tr>
+      <w:tr>
+        <w:tc>
+          <w:tcPr>
+            <w:tcW w:type="dxa" w:w="1900"/>
+            <w:tcBorders>
+              <w:top w:val="single" w:color="B4C6DC" w:sz="4"/>
+              <w:left w:val="single" w:color="B4C6DC" w:sz="4"/>
+              <w:bottom w:val="single" w:color="B4C6DC" w:sz="4"/>
+              <w:right w:val="single" w:color="B4C6DC" w:sz="4"/>
+            </w:tcBorders>
+            <w:tcMar>
+              <w:top w:type="dxa" w:w="80"/>
+              <w:left w:type="dxa" w:w="120"/>
+              <w:bottom w:type="dxa" w:w="80"/>
+              <w:right w:type="dxa" w:w="120"/>
+            </w:tcMar>
+          </w:tcPr>
+          <w:p>
+            <w:r>
+              <w:t xml:space="preserve">11:59:57 pm</w:t>
+            </w:r>
+          </w:p>
+        </w:tc>
+        <w:tc>
+          <w:tcPr>
+            <w:tcW w:type="dxa" w:w="7460"/>
+            <w:tcBorders>
+              <w:top w:val="single" w:color="B4C6DC" w:sz="4"/>
+              <w:left w:val="single" w:color="B4C6DC" w:sz="4"/>
+              <w:bottom w:val="single" w:color="B4C6DC" w:sz="4"/>
+              <w:right w:val="single" w:color="B4C6DC" w:sz="4"/>
+            </w:tcBorders>
+            <w:tcMar>
+              <w:top w:type="dxa" w:w="80"/>
+              <w:left w:type="dxa" w:w="120"/>
+              <w:bottom w:type="dxa" w:w="80"/>
+              <w:right w:type="dxa" w:w="120"/>
+            </w:tcMar>
+          </w:tcPr>
+          <w:p>
+            <w:r>
+              <w:t xml:space="preserve">Every tab re-checks the calendar every 1.5 seconds. The first option, in your order, that shows the day as open is booked and confirmed, usually 1 to 3 seconds after midnight.</w:t>
+            </w:r>
+          </w:p>
+        </w:tc>
+      </w:tr>
+      <w:tr>
+        <w:tc>
+          <w:tcPr>
+            <w:tcW w:type="dxa" w:w="1900"/>
+            <w:tcBorders>
+              <w:top w:val="single" w:color="B4C6DC" w:sz="4"/>
+              <w:left w:val="single" w:color="B4C6DC" w:sz="4"/>
+              <w:bottom w:val="single" w:color="B4C6DC" w:sz="4"/>
+              <w:right w:val="single" w:color="B4C6DC" w:sz="4"/>
+            </w:tcBorders>
+            <w:tcMar>
+              <w:top w:type="dxa" w:w="80"/>
+              <w:left w:type="dxa" w:w="120"/>
+              <w:bottom w:type="dxa" w:w="80"/>
+              <w:right w:type="dxa" w:w="120"/>
+            </w:tcMar>
+          </w:tcPr>
+          <w:p>
+            <w:r>
+              <w:t xml:space="preserve">12:00 to 12:20 am</w:t>
+            </w:r>
+          </w:p>
+        </w:tc>
+        <w:tc>
+          <w:tcPr>
+            <w:tcW w:type="dxa" w:w="7460"/>
+            <w:tcBorders>
+              <w:top w:val="single" w:color="B4C6DC" w:sz="4"/>
+              <w:left w:val="single" w:color="B4C6DC" w:sz="4"/>
+              <w:bottom w:val="single" w:color="B4C6DC" w:sz="4"/>
+              <w:right w:val="single" w:color="B4C6DC" w:sz="4"/>
+            </w:tcBorders>
+            <w:tcMar>
+              <w:top w:type="dxa" w:w="80"/>
+              <w:left w:type="dxa" w:w="120"/>
+              <w:bottom w:type="dxa" w:w="80"/>
+              <w:right w:type="dxa" w:w="120"/>
+            </w:tcMar>
+          </w:tcPr>
+          <w:p>
+            <w:r>
+              <w:t xml:space="preserve">If nothing opened, keeps retrying every 30 seconds for 20 minutes.</w:t>
+            </w:r>
+          </w:p>
+        </w:tc>
+      </w:tr>
+      <w:tr>
+        <w:tc>
+          <w:tcPr>
+            <w:tcW w:type="dxa" w:w="1900"/>
+            <w:tcBorders>
+              <w:top w:val="single" w:color="B4C6DC" w:sz="4"/>
+              <w:left w:val="single" w:color="B4C6DC" w:sz="4"/>
+              <w:bottom w:val="single" w:color="B4C6DC" w:sz="4"/>
+              <w:right w:val="single" w:color="B4C6DC" w:sz="4"/>
+            </w:tcBorders>
+            <w:tcMar>
+              <w:top w:type="dxa" w:w="80"/>
+              <w:left w:type="dxa" w:w="120"/>
+              <w:bottom w:type="dxa" w:w="80"/>
+              <w:right w:type="dxa" w:w="120"/>
+            </w:tcMar>
+          </w:tcPr>
+          <w:p>
+            <w:r>
+              <w:t xml:space="preserve">When done</w:t>
+            </w:r>
+          </w:p>
+        </w:tc>
+        <w:tc>
+          <w:tcPr>
+            <w:tcW w:type="dxa" w:w="7460"/>
+            <w:tcBorders>
+              <w:top w:val="single" w:color="B4C6DC" w:sz="4"/>
+              <w:left w:val="single" w:color="B4C6DC" w:sz="4"/>
+              <w:bottom w:val="single" w:color="B4C6DC" w:sz="4"/>
+              <w:right w:val="single" w:color="B4C6DC" w:sz="4"/>
+            </w:tcBorders>
+            <w:tcMar>
+              <w:top w:type="dxa" w:w="80"/>
+              <w:left w:type="dxa" w:w="120"/>
+              <w:bottom w:type="dxa" w:w="80"/>
+              <w:right w:type="dxa" w:w="120"/>
+            </w:tcMar>
+          </w:tcPr>
+          <w:p>
+            <w:r>
+              <w:t xml:space="preserve">Posts the result to the Status tab and the run's page on GitHub. A run that booked nothing is marked failed, and GitHub emails you.</w:t>
+            </w:r>
+          </w:p>
+        </w:tc>
+      </w:tr>
+      <w:tr>
+        <w:tc>
+          <w:tcPr>
+            <w:tcW w:type="dxa" w:w="1900"/>
+            <w:tcBorders>
+              <w:top w:val="single" w:color="B4C6DC" w:sz="4"/>
+              <w:left w:val="single" w:color="B4C6DC" w:sz="4"/>
+              <w:bottom w:val="single" w:color="B4C6DC" w:sz="4"/>
+              <w:right w:val="single" w:color="B4C6DC" w:sz="4"/>
+            </w:tcBorders>
+            <w:tcMar>
+              <w:top w:type="dxa" w:w="80"/>
+              <w:left w:type="dxa" w:w="120"/>
+              <w:bottom w:type="dxa" w:w="80"/>
+              <w:right w:type="dxa" w:w="120"/>
+            </w:tcMar>
+          </w:tcPr>
+          <w:p>
+            <w:r>
+              <w:t xml:space="preserve">After midnight</w:t>
+            </w:r>
+          </w:p>
+        </w:tc>
+        <w:tc>
+          <w:tcPr>
+            <w:tcW w:type="dxa" w:w="7460"/>
+            <w:tcBorders>
+              <w:top w:val="single" w:color="B4C6DC" w:sz="4"/>
+              <w:left w:val="single" w:color="B4C6DC" w:sz="4"/>
+              <w:bottom w:val="single" w:color="B4C6DC" w:sz="4"/>
+              <w:right w:val="single" w:color="B4C6DC" w:sz="4"/>
+            </w:tcBorders>
+            <w:tcMar>
+              <w:top w:type="dxa" w:w="80"/>
+              <w:left w:type="dxa" w:w="120"/>
+              <w:bottom w:type="dxa" w:w="80"/>
+              <w:right w:type="dxa" w:w="120"/>
+            </w:tcMar>
+          </w:tcPr>
+          <w:p>
+            <w:r>
+              <w:t xml:space="preserve">Any later start that was queued behind finds the next opening is a day away and ends with "Nothing to do".</w:t>
+            </w:r>
+          </w:p>
+        </w:tc>
+      </w:tr>
+    </w:tbl>
+    <w:p>
+      <w:pPr>
+        <w:spacing w:after="60"/>
+      </w:pPr>
+    </w:p>
+    <w:p>
+      <w:pPr>
+        <w:pStyle w:val="Heading1"/>
+      </w:pPr>
+      <w:r>
+        <w:t xml:space="preserve">8. How everything stays in sync</w:t>
+      </w:r>
+    </w:p>
+    <w:tbl>
+      <w:tblPr>
+        <w:tblW w:type="dxa" w:w="9360"/>
+        <w:tblBorders>
+          <w:top w:val="single" w:color="auto" w:sz="4"/>
+          <w:left w:val="single" w:color="auto" w:sz="4"/>
+          <w:bottom w:val="single" w:color="auto" w:sz="4"/>
+          <w:right w:val="single" w:color="auto" w:sz="4"/>
+          <w:insideH w:val="single" w:color="auto" w:sz="4"/>
+          <w:insideV w:val="single" w:color="auto" w:sz="4"/>
+        </w:tblBorders>
+      </w:tblPr>
+      <w:tblGrid>
+        <w:gridCol w:w="3000"/>
+        <w:gridCol w:w="6360"/>
+      </w:tblGrid>
+      <w:tr>
+        <w:trPr>
+          <w:tblHeader/>
+        </w:trPr>
+        <w:tc>
+          <w:tcPr>
+            <w:tcW w:type="dxa" w:w="3000"/>
+            <w:tcBorders>
+              <w:top w:val="single" w:color="B4C6DC" w:sz="4"/>
+              <w:left w:val="single" w:color="B4C6DC" w:sz="4"/>
+              <w:bottom w:val="single" w:color="B4C6DC" w:sz="4"/>
+              <w:right w:val="single" w:color="B4C6DC" w:sz="4"/>
+            </w:tcBorders>
+            <w:shd w:fill="1F4E79" w:color="auto" w:val="clear"/>
+            <w:tcMar>
+              <w:top w:type="dxa" w:w="80"/>
+              <w:left w:type="dxa" w:w="120"/>
+              <w:bottom w:type="dxa" w:w="80"/>
+              <w:right w:type="dxa" w:w="120"/>
+            </w:tcMar>
+          </w:tcPr>
+          <w:p>
+            <w:r>
+              <w:rPr>
+                <w:b/>
+                <w:bCs/>
+                <w:color w:val="FFFFFF"/>
+              </w:rPr>
+              <w:t xml:space="preserve">Connection</w:t>
+            </w:r>
+          </w:p>
+        </w:tc>
+        <w:tc>
+          <w:tcPr>
+            <w:tcW w:type="dxa" w:w="6360"/>
+            <w:tcBorders>
+              <w:top w:val="single" w:color="B4C6DC" w:sz="4"/>
+              <w:left w:val="single" w:color="B4C6DC" w:sz="4"/>
+              <w:bottom w:val="single" w:color="B4C6DC" w:sz="4"/>
+              <w:right w:val="single" w:color="B4C6DC" w:sz="4"/>
+            </w:tcBorders>
+            <w:shd w:fill="1F4E79" w:color="auto" w:val="clear"/>
+            <w:tcMar>
+              <w:top w:type="dxa" w:w="80"/>
+              <w:left w:type="dxa" w:w="120"/>
+              <w:bottom w:type="dxa" w:w="80"/>
+              <w:right w:type="dxa" w:w="120"/>
+            </w:tcMar>
+          </w:tcPr>
+          <w:p>
+            <w:r>
+              <w:rPr>
+                <w:b/>
+                <w:bCs/>
+                <w:color w:val="FFFFFF"/>
+              </w:rPr>
+              <w:t xml:space="preserve">How and when</w:t>
+            </w:r>
+          </w:p>
+        </w:tc>
+      </w:tr>
+      <w:tr>
+        <w:tc>
+          <w:tcPr>
+            <w:tcW w:type="dxa" w:w="3000"/>
+            <w:tcBorders>
+              <w:top w:val="single" w:color="B4C6DC" w:sz="4"/>
+              <w:left w:val="single" w:color="B4C6DC" w:sz="4"/>
+              <w:bottom w:val="single" w:color="B4C6DC" w:sz="4"/>
+              <w:right w:val="single" w:color="B4C6DC" w:sz="4"/>
+            </w:tcBorders>
+            <w:tcMar>
+              <w:top w:type="dxa" w:w="80"/>
+              <w:left w:type="dxa" w:w="120"/>
+              <w:bottom w:type="dxa" w:w="80"/>
+              <w:right w:type="dxa" w:w="120"/>
+            </w:tcMar>
+          </w:tcPr>
+          <w:p>
+            <w:r>
+              <w:rPr>
+                <w:b/>
+                <w:bCs/>
+              </w:rPr>
+              <w:t xml:space="preserve">Team sheet → bot</w:t>
+            </w:r>
+          </w:p>
+        </w:tc>
+        <w:tc>
+          <w:tcPr>
+            <w:tcW w:type="dxa" w:w="6360"/>
+            <w:tcBorders>
+              <w:top w:val="single" w:color="B4C6DC" w:sz="4"/>
+              <w:left w:val="single" w:color="B4C6DC" w:sz="4"/>
+              <w:bottom w:val="single" w:color="B4C6DC" w:sz="4"/>
+              <w:right w:val="single" w:color="B4C6DC" w:sz="4"/>
+            </w:tcBorders>
+            <w:tcMar>
+              <w:top w:type="dxa" w:w="80"/>
+              <w:left w:type="dxa" w:w="120"/>
+              <w:bottom w:type="dxa" w:w="80"/>
+              <w:right w:type="dxa" w:w="120"/>
+            </w:tcMar>
+          </w:tcPr>
+          <w:p>
+            <w:r>
+              <w:t xml:space="preserve">The bot reads the plan at the start of each run and again about 2½ minutes before midnight.</w:t>
+            </w:r>
+          </w:p>
+        </w:tc>
+      </w:tr>
+      <w:tr>
+        <w:tc>
+          <w:tcPr>
+            <w:tcW w:type="dxa" w:w="3000"/>
+            <w:tcBorders>
+              <w:top w:val="single" w:color="B4C6DC" w:sz="4"/>
+              <w:left w:val="single" w:color="B4C6DC" w:sz="4"/>
+              <w:bottom w:val="single" w:color="B4C6DC" w:sz="4"/>
+              <w:right w:val="single" w:color="B4C6DC" w:sz="4"/>
+            </w:tcBorders>
+            <w:tcMar>
+              <w:top w:type="dxa" w:w="80"/>
+              <w:left w:type="dxa" w:w="120"/>
+              <w:bottom w:type="dxa" w:w="80"/>
+              <w:right w:type="dxa" w:w="120"/>
+            </w:tcMar>
+          </w:tcPr>
+          <w:p>
+            <w:r>
+              <w:rPr>
+                <w:b/>
+                <w:bCs/>
+              </w:rPr>
+              <w:t xml:space="preserve">Bot → Status tab</w:t>
+            </w:r>
+          </w:p>
+        </w:tc>
+        <w:tc>
+          <w:tcPr>
+            <w:tcW w:type="dxa" w:w="6360"/>
+            <w:tcBorders>
+              <w:top w:val="single" w:color="B4C6DC" w:sz="4"/>
+              <w:left w:val="single" w:color="B4C6DC" w:sz="4"/>
+              <w:bottom w:val="single" w:color="B4C6DC" w:sz="4"/>
+              <w:right w:val="single" w:color="B4C6DC" w:sz="4"/>
+            </w:tcBorders>
+            <w:tcMar>
+              <w:top w:type="dxa" w:w="80"/>
+              <w:left w:type="dxa" w:w="120"/>
+              <w:bottom w:type="dxa" w:w="80"/>
+              <w:right w:type="dxa" w:w="120"/>
+            </w:tcMar>
+          </w:tcPr>
+          <w:p>
+            <w:r>
+              <w:t xml:space="preserve">After each run (test, booking or failure) the bot sends one row to the sheet's script, which adds it to the top of the Status tab. Only usernames in the plan are accepted; passwords are never sent.</w:t>
+            </w:r>
+          </w:p>
+        </w:tc>
+      </w:tr>
+      <w:tr>
+        <w:tc>
+          <w:tcPr>
+            <w:tcW w:type="dxa" w:w="3000"/>
+            <w:tcBorders>
+              <w:top w:val="single" w:color="B4C6DC" w:sz="4"/>
+              <w:left w:val="single" w:color="B4C6DC" w:sz="4"/>
+              <w:bottom w:val="single" w:color="B4C6DC" w:sz="4"/>
+              <w:right w:val="single" w:color="B4C6DC" w:sz="4"/>
+            </w:tcBorders>
+            <w:tcMar>
+              <w:top w:type="dxa" w:w="80"/>
+              <w:left w:type="dxa" w:w="120"/>
+              <w:bottom w:type="dxa" w:w="80"/>
+              <w:right w:type="dxa" w:w="120"/>
+            </w:tcMar>
+          </w:tcPr>
+          <w:p>
+            <w:r>
+              <w:rPr>
+                <w:b/>
+                <w:bCs/>
+              </w:rPr>
+              <w:t xml:space="preserve">Status tab → bookings doc</w:t>
+            </w:r>
+          </w:p>
+        </w:tc>
+        <w:tc>
+          <w:tcPr>
+            <w:tcW w:type="dxa" w:w="6360"/>
+            <w:tcBorders>
+              <w:top w:val="single" w:color="B4C6DC" w:sz="4"/>
+              <w:left w:val="single" w:color="B4C6DC" w:sz="4"/>
+              <w:bottom w:val="single" w:color="B4C6DC" w:sz="4"/>
+              <w:right w:val="single" w:color="B4C6DC" w:sz="4"/>
+            </w:tcBorders>
+            <w:tcMar>
+              <w:top w:type="dxa" w:w="80"/>
+              <w:left w:type="dxa" w:w="120"/>
+              <w:bottom w:type="dxa" w:w="80"/>
+              <w:right w:type="dxa" w:w="120"/>
+            </w:tcMar>
+          </w:tcPr>
+          <w:p>
+            <w:r>
+              <w:t xml:space="preserve">Gemini reads the Status tab and updates the bookings doc pinned in the group chat (section 9).</w:t>
+            </w:r>
+          </w:p>
+        </w:tc>
+      </w:tr>
+      <w:tr>
+        <w:tc>
+          <w:tcPr>
+            <w:tcW w:type="dxa" w:w="3000"/>
+            <w:tcBorders>
+              <w:top w:val="single" w:color="B4C6DC" w:sz="4"/>
+              <w:left w:val="single" w:color="B4C6DC" w:sz="4"/>
+              <w:bottom w:val="single" w:color="B4C6DC" w:sz="4"/>
+              <w:right w:val="single" w:color="B4C6DC" w:sz="4"/>
+            </w:tcBorders>
+            <w:tcMar>
+              <w:top w:type="dxa" w:w="80"/>
+              <w:left w:type="dxa" w:w="120"/>
+              <w:bottom w:type="dxa" w:w="80"/>
+              <w:right w:type="dxa" w:w="120"/>
+            </w:tcMar>
+          </w:tcPr>
+          <w:p>
+            <w:r>
+              <w:rPr>
+                <w:b/>
+                <w:bCs/>
+              </w:rPr>
+              <w:t xml:space="preserve">GitHub → everyone</w:t>
+            </w:r>
+          </w:p>
+        </w:tc>
+        <w:tc>
+          <w:tcPr>
+            <w:tcW w:type="dxa" w:w="6360"/>
+            <w:tcBorders>
+              <w:top w:val="single" w:color="B4C6DC" w:sz="4"/>
+              <w:left w:val="single" w:color="B4C6DC" w:sz="4"/>
+              <w:bottom w:val="single" w:color="B4C6DC" w:sz="4"/>
+              <w:right w:val="single" w:color="B4C6DC" w:sz="4"/>
+            </w:tcBorders>
+            <w:tcMar>
+              <w:top w:type="dxa" w:w="80"/>
+              <w:left w:type="dxa" w:w="120"/>
+              <w:bottom w:type="dxa" w:w="80"/>
+              <w:right w:type="dxa" w:w="120"/>
+            </w:tcMar>
+          </w:tcPr>
+          <w:p>
+            <w:r>
+              <w:t xml:space="preserve">Every run downloads the newest code and booking steps from the main repo. Forks read the shared settings (sheet link, Status link, booking steps) from the main repo, so a fix there reaches everyone on their next run.</w:t>
+            </w:r>
+          </w:p>
+        </w:tc>
+      </w:tr>
+      <w:tr>
+        <w:tc>
+          <w:tcPr>
+            <w:tcW w:type="dxa" w:w="3000"/>
+            <w:tcBorders>
+              <w:top w:val="single" w:color="B4C6DC" w:sz="4"/>
+              <w:left w:val="single" w:color="B4C6DC" w:sz="4"/>
+              <w:bottom w:val="single" w:color="B4C6DC" w:sz="4"/>
+              <w:right w:val="single" w:color="B4C6DC" w:sz="4"/>
+            </w:tcBorders>
+            <w:tcMar>
+              <w:top w:type="dxa" w:w="80"/>
+              <w:left w:type="dxa" w:w="120"/>
+              <w:bottom w:type="dxa" w:w="80"/>
+              <w:right w:type="dxa" w:w="120"/>
+            </w:tcMar>
+          </w:tcPr>
+          <w:p>
+            <w:r>
+              <w:rPr>
+                <w:b/>
+                <w:bCs/>
+              </w:rPr>
+              <w:t xml:space="preserve">Portal → you</w:t>
+            </w:r>
+          </w:p>
+        </w:tc>
+        <w:tc>
+          <w:tcPr>
+            <w:tcW w:type="dxa" w:w="6360"/>
+            <w:tcBorders>
+              <w:top w:val="single" w:color="B4C6DC" w:sz="4"/>
+              <w:left w:val="single" w:color="B4C6DC" w:sz="4"/>
+              <w:bottom w:val="single" w:color="B4C6DC" w:sz="4"/>
+              <w:right w:val="single" w:color="B4C6DC" w:sz="4"/>
+            </w:tcBorders>
+            <w:tcMar>
+              <w:top w:type="dxa" w:w="80"/>
+              <w:left w:type="dxa" w:w="120"/>
+              <w:bottom w:type="dxa" w:w="80"/>
+              <w:right w:type="dxa" w:w="120"/>
+            </w:tcMar>
+          </w:tcPr>
+          <w:p>
+            <w:r>
+              <w:t xml:space="preserve">The portal's My Bookings page is the final word. The sheet and doc only know what the bot did.</w:t>
+            </w:r>
+          </w:p>
+        </w:tc>
+      </w:tr>
+    </w:tbl>
+    <w:p>
+      <w:pPr>
+        <w:spacing w:after="60"/>
+      </w:pPr>
+    </w:p>
+    <w:p>
+      <w:pPr>
+        <w:pStyle w:val="Heading1"/>
+      </w:pPr>
+      <w:r>
+        <w:t xml:space="preserve">9. Group chat updates (bookings doc)</w:t>
+      </w:r>
+    </w:p>
+    <w:p>
+      <w:pPr>
+        <w:spacing w:after="120"/>
+      </w:pPr>
+      <w:r>
+        <w:t xml:space="preserve">A Google Doc pinned in the group chat lists the week's bookings. Gemini fills it in from the Status tab, so nobody has to post updates by hand.</w:t>
+      </w:r>
+    </w:p>
+    <w:p>
+      <w:pPr>
+        <w:pStyle w:val="Heading2"/>
+      </w:pPr>
+      <w:r>
+        <w:t xml:space="preserve">9.1 What the Status tab holds</w:t>
+      </w:r>
+    </w:p>
+    <w:p>
+      <w:pPr>
+        <w:spacing w:after="120"/>
+      </w:pPr>
+      <w:r>
+        <w:t xml:space="preserve">Newest row first, with these columns: </w:t>
+      </w:r>
+      <w:r>
+        <w:rPr>
+          <w:b/>
+          <w:bCs/>
+        </w:rPr>
+        <w:t xml:space="preserve">When (Ottawa), Name, Username, For date, Room, Time, Result, Details, Ran from</w:t>
+      </w:r>
+      <w:r>
+        <w:t xml:space="preserve">.</w:t>
+      </w:r>
+    </w:p>
+    <w:tbl>
+      <w:tblPr>
+        <w:tblW w:type="dxa" w:w="9360"/>
+        <w:tblBorders>
+          <w:top w:val="single" w:color="auto" w:sz="4"/>
+          <w:left w:val="single" w:color="auto" w:sz="4"/>
+          <w:bottom w:val="single" w:color="auto" w:sz="4"/>
+          <w:right w:val="single" w:color="auto" w:sz="4"/>
+          <w:insideH w:val="single" w:color="auto" w:sz="4"/>
+          <w:insideV w:val="single" w:color="auto" w:sz="4"/>
+        </w:tblBorders>
+      </w:tblPr>
+      <w:tblGrid>
+        <w:gridCol w:w="2600"/>
+        <w:gridCol w:w="6760"/>
+      </w:tblGrid>
+      <w:tr>
+        <w:trPr>
+          <w:tblHeader/>
+        </w:trPr>
+        <w:tc>
+          <w:tcPr>
+            <w:tcW w:type="dxa" w:w="2600"/>
+            <w:tcBorders>
+              <w:top w:val="single" w:color="B4C6DC" w:sz="4"/>
+              <w:left w:val="single" w:color="B4C6DC" w:sz="4"/>
+              <w:bottom w:val="single" w:color="B4C6DC" w:sz="4"/>
+              <w:right w:val="single" w:color="B4C6DC" w:sz="4"/>
+            </w:tcBorders>
+            <w:shd w:fill="1F4E79" w:color="auto" w:val="clear"/>
+            <w:tcMar>
+              <w:top w:type="dxa" w:w="80"/>
+              <w:left w:type="dxa" w:w="120"/>
+              <w:bottom w:type="dxa" w:w="80"/>
+              <w:right w:type="dxa" w:w="120"/>
+            </w:tcMar>
+          </w:tcPr>
+          <w:p>
+            <w:r>
+              <w:rPr>
+                <w:b/>
+                <w:bCs/>
+                <w:color w:val="FFFFFF"/>
+              </w:rPr>
+              <w:t xml:space="preserve">Column</w:t>
+            </w:r>
+          </w:p>
+        </w:tc>
+        <w:tc>
+          <w:tcPr>
+            <w:tcW w:type="dxa" w:w="6760"/>
+            <w:tcBorders>
+              <w:top w:val="single" w:color="B4C6DC" w:sz="4"/>
+              <w:left w:val="single" w:color="B4C6DC" w:sz="4"/>
+              <w:bottom w:val="single" w:color="B4C6DC" w:sz="4"/>
+              <w:right w:val="single" w:color="B4C6DC" w:sz="4"/>
+            </w:tcBorders>
+            <w:shd w:fill="1F4E79" w:color="auto" w:val="clear"/>
+            <w:tcMar>
+              <w:top w:type="dxa" w:w="80"/>
+              <w:left w:type="dxa" w:w="120"/>
+              <w:bottom w:type="dxa" w:w="80"/>
+              <w:right w:type="dxa" w:w="120"/>
+            </w:tcMar>
+          </w:tcPr>
+          <w:p>
+            <w:r>
+              <w:rPr>
+                <w:b/>
+                <w:bCs/>
+                <w:color w:val="FFFFFF"/>
+              </w:rPr>
+              <w:t xml:space="preserve">Meaning</w:t>
+            </w:r>
+          </w:p>
+        </w:tc>
+      </w:tr>
+      <w:tr>
+        <w:tc>
+          <w:tcPr>
+            <w:tcW w:type="dxa" w:w="2600"/>
+            <w:tcBorders>
+              <w:top w:val="single" w:color="B4C6DC" w:sz="4"/>
+              <w:left w:val="single" w:color="B4C6DC" w:sz="4"/>
+              <w:bottom w:val="single" w:color="B4C6DC" w:sz="4"/>
+              <w:right w:val="single" w:color="B4C6DC" w:sz="4"/>
+            </w:tcBorders>
+            <w:tcMar>
+              <w:top w:type="dxa" w:w="80"/>
+              <w:left w:type="dxa" w:w="120"/>
+              <w:bottom w:type="dxa" w:w="80"/>
+              <w:right w:type="dxa" w:w="120"/>
+            </w:tcMar>
+          </w:tcPr>
+          <w:p>
+            <w:r>
+              <w:rPr>
+                <w:b/>
+                <w:bCs/>
+              </w:rPr>
+              <w:t xml:space="preserve">For date</w:t>
+            </w:r>
+          </w:p>
+        </w:tc>
+        <w:tc>
+          <w:tcPr>
+            <w:tcW w:type="dxa" w:w="6760"/>
+            <w:tcBorders>
+              <w:top w:val="single" w:color="B4C6DC" w:sz="4"/>
+              <w:left w:val="single" w:color="B4C6DC" w:sz="4"/>
+              <w:bottom w:val="single" w:color="B4C6DC" w:sz="4"/>
+              <w:right w:val="single" w:color="B4C6DC" w:sz="4"/>
+            </w:tcBorders>
+            <w:tcMar>
+              <w:top w:type="dxa" w:w="80"/>
+              <w:left w:type="dxa" w:w="120"/>
+              <w:bottom w:type="dxa" w:w="80"/>
+              <w:right w:type="dxa" w:w="120"/>
+            </w:tcMar>
+          </w:tcPr>
+          <w:p>
+            <w:r>
+              <w:t xml:space="preserve">The day the room is booked for. Use this, not "When", which is when the bot ran.</w:t>
+            </w:r>
+          </w:p>
+        </w:tc>
+      </w:tr>
+      <w:tr>
+        <w:tc>
+          <w:tcPr>
+            <w:tcW w:type="dxa" w:w="2600"/>
+            <w:tcBorders>
+              <w:top w:val="single" w:color="B4C6DC" w:sz="4"/>
+              <w:left w:val="single" w:color="B4C6DC" w:sz="4"/>
+              <w:bottom w:val="single" w:color="B4C6DC" w:sz="4"/>
+              <w:right w:val="single" w:color="B4C6DC" w:sz="4"/>
+            </w:tcBorders>
+            <w:tcMar>
+              <w:top w:type="dxa" w:w="80"/>
+              <w:left w:type="dxa" w:w="120"/>
+              <w:bottom w:type="dxa" w:w="80"/>
+              <w:right w:type="dxa" w:w="120"/>
+            </w:tcMar>
+          </w:tcPr>
+          <w:p>
+            <w:r>
+              <w:rPr>
+                <w:b/>
+                <w:bCs/>
+              </w:rPr>
+              <w:t xml:space="preserve">Result</w:t>
+            </w:r>
+          </w:p>
+        </w:tc>
+        <w:tc>
+          <w:tcPr>
+            <w:tcW w:type="dxa" w:w="6760"/>
+            <w:tcBorders>
+              <w:top w:val="single" w:color="B4C6DC" w:sz="4"/>
+              <w:left w:val="single" w:color="B4C6DC" w:sz="4"/>
+              <w:bottom w:val="single" w:color="B4C6DC" w:sz="4"/>
+              <w:right w:val="single" w:color="B4C6DC" w:sz="4"/>
+            </w:tcBorders>
+            <w:tcMar>
+              <w:top w:type="dxa" w:w="80"/>
+              <w:left w:type="dxa" w:w="120"/>
+              <w:bottom w:type="dxa" w:w="80"/>
+              <w:right w:type="dxa" w:w="120"/>
+            </w:tcMar>
+          </w:tcPr>
+          <w:p>
+            <w:r>
+              <w:t xml:space="preserve">Booked, Not booked, Test passed, Sign-in failed, Not set up or Test failed. Only "Booked" is a real booking.</w:t>
+            </w:r>
+          </w:p>
+        </w:tc>
+      </w:tr>
+      <w:tr>
+        <w:tc>
+          <w:tcPr>
+            <w:tcW w:type="dxa" w:w="2600"/>
+            <w:tcBorders>
+              <w:top w:val="single" w:color="B4C6DC" w:sz="4"/>
+              <w:left w:val="single" w:color="B4C6DC" w:sz="4"/>
+              <w:bottom w:val="single" w:color="B4C6DC" w:sz="4"/>
+              <w:right w:val="single" w:color="B4C6DC" w:sz="4"/>
+            </w:tcBorders>
+            <w:tcMar>
+              <w:top w:type="dxa" w:w="80"/>
+              <w:left w:type="dxa" w:w="120"/>
+              <w:bottom w:type="dxa" w:w="80"/>
+              <w:right w:type="dxa" w:w="120"/>
+            </w:tcMar>
+          </w:tcPr>
+          <w:p>
+            <w:r>
+              <w:rPr>
+                <w:b/>
+                <w:bCs/>
+              </w:rPr>
+              <w:t xml:space="preserve">Room / Time</w:t>
+            </w:r>
+          </w:p>
+        </w:tc>
+        <w:tc>
+          <w:tcPr>
+            <w:tcW w:type="dxa" w:w="6760"/>
+            <w:tcBorders>
+              <w:top w:val="single" w:color="B4C6DC" w:sz="4"/>
+              <w:left w:val="single" w:color="B4C6DC" w:sz="4"/>
+              <w:bottom w:val="single" w:color="B4C6DC" w:sz="4"/>
+              <w:right w:val="single" w:color="B4C6DC" w:sz="4"/>
+            </w:tcBorders>
+            <w:tcMar>
+              <w:top w:type="dxa" w:w="80"/>
+              <w:left w:type="dxa" w:w="120"/>
+              <w:bottom w:type="dxa" w:w="80"/>
+              <w:right w:type="dxa" w:w="120"/>
+            </w:tcMar>
+          </w:tcPr>
+          <w:p>
+            <w:r>
+              <w:t xml:space="preserve">The room and time slot that was booked, like CB 2302 and 12:00-15:00.</w:t>
+            </w:r>
+          </w:p>
+        </w:tc>
+      </w:tr>
+      <w:tr>
+        <w:tc>
+          <w:tcPr>
+            <w:tcW w:type="dxa" w:w="2600"/>
+            <w:tcBorders>
+              <w:top w:val="single" w:color="B4C6DC" w:sz="4"/>
+              <w:left w:val="single" w:color="B4C6DC" w:sz="4"/>
+              <w:bottom w:val="single" w:color="B4C6DC" w:sz="4"/>
+              <w:right w:val="single" w:color="B4C6DC" w:sz="4"/>
+            </w:tcBorders>
+            <w:tcMar>
+              <w:top w:type="dxa" w:w="80"/>
+              <w:left w:type="dxa" w:w="120"/>
+              <w:bottom w:type="dxa" w:w="80"/>
+              <w:right w:type="dxa" w:w="120"/>
+            </w:tcMar>
+          </w:tcPr>
+          <w:p>
+            <w:r>
+              <w:rPr>
+                <w:b/>
+                <w:bCs/>
+              </w:rPr>
+              <w:t xml:space="preserve">Ran from</w:t>
+            </w:r>
+          </w:p>
+        </w:tc>
+        <w:tc>
+          <w:tcPr>
+            <w:tcW w:type="dxa" w:w="6760"/>
+            <w:tcBorders>
+              <w:top w:val="single" w:color="B4C6DC" w:sz="4"/>
+              <w:left w:val="single" w:color="B4C6DC" w:sz="4"/>
+              <w:bottom w:val="single" w:color="B4C6DC" w:sz="4"/>
+              <w:right w:val="single" w:color="B4C6DC" w:sz="4"/>
+            </w:tcBorders>
+            <w:tcMar>
+              <w:top w:type="dxa" w:w="80"/>
+              <w:left w:type="dxa" w:w="120"/>
+              <w:bottom w:type="dxa" w:w="80"/>
+              <w:right w:type="dxa" w:w="120"/>
+            </w:tcMar>
+          </w:tcPr>
+          <w:p>
+            <w:r>
+              <w:t xml:space="preserve">Cloud or the computer app.</w:t>
+            </w:r>
+          </w:p>
+        </w:tc>
+      </w:tr>
+    </w:tbl>
+    <w:p>
+      <w:pPr>
+        <w:spacing w:after="60"/>
+      </w:pPr>
+    </w:p>
+    <w:p>
+      <w:pPr>
+        <w:pStyle w:val="Heading2"/>
+      </w:pPr>
+      <w:r>
+        <w:t xml:space="preserve">9.2 Rules for Gemini</w:t>
+      </w:r>
+    </w:p>
+    <w:p>
+      <w:pPr>
+        <w:pStyle w:val="ListParagraph"/>
+        <w:numPr>
+          <w:ilvl w:val="0"/>
+          <w:numId w:val="6"/>
+        </w:numPr>
+        <w:spacing w:after="60"/>
+      </w:pPr>
+      <w:r>
+        <w:t xml:space="preserve">Use only rows where Result is </w:t>
+      </w:r>
+      <w:r>
+        <w:rPr>
+          <w:b/>
+          <w:bCs/>
+        </w:rPr>
+        <w:t xml:space="preserve">Booked</w:t>
+      </w:r>
+      <w:r>
+        <w:t xml:space="preserve">.</w:t>
+      </w:r>
+    </w:p>
+    <w:p>
+      <w:pPr>
+        <w:pStyle w:val="ListParagraph"/>
+        <w:numPr>
+          <w:ilvl w:val="0"/>
+          <w:numId w:val="6"/>
+        </w:numPr>
+        <w:spacing w:after="60"/>
+      </w:pPr>
+      <w:r>
+        <w:t xml:space="preserve">Use the </w:t>
+      </w:r>
+      <w:r>
+        <w:rPr>
+          <w:b/>
+          <w:bCs/>
+        </w:rPr>
+        <w:t xml:space="preserve">For date</w:t>
+      </w:r>
+      <w:r>
+        <w:t xml:space="preserve"> column, and show only today and later, so past bookings drop off.</w:t>
+      </w:r>
+    </w:p>
+    <w:p>
+      <w:pPr>
+        <w:pStyle w:val="ListParagraph"/>
+        <w:numPr>
+          <w:ilvl w:val="0"/>
+          <w:numId w:val="6"/>
+        </w:numPr>
+        <w:spacing w:after="60"/>
+      </w:pPr>
+      <w:r>
+        <w:t xml:space="preserve">Group by day and list name, room and time.</w:t>
+      </w:r>
+    </w:p>
+    <w:p>
+      <w:pPr>
+        <w:pStyle w:val="ListParagraph"/>
+        <w:numPr>
+          <w:ilvl w:val="0"/>
+          <w:numId w:val="6"/>
+        </w:numPr>
+        <w:spacing w:after="60"/>
+      </w:pPr>
+      <w:r>
+        <w:t xml:space="preserve">Update after the night's runs have reported, for example each morning at 7 am. Results arrive between about 12:00 and 12:20 am.</w:t>
+      </w:r>
+    </w:p>
+    <w:p>
+      <w:pPr>
+        <w:pStyle w:val="Heading2"/>
+      </w:pPr>
+      <w:r>
+        <w:t xml:space="preserve">9.3 What it can't see</w:t>
       </w:r>
     </w:p>
     <w:p>
@@ -3338,10 +4657,10 @@
           <w:b/>
           <w:bCs/>
         </w:rPr>
-        <w:t xml:space="preserve">Midnight mode: </w:t>
-      </w:r>
-      <w:r>
-        <w:t xml:space="preserve">signs in early, prepares up to 6 options, syncs to the portal clock, books within seconds of opening.</w:t>
+        <w:t xml:space="preserve">Bookings made by hand</w:t>
+      </w:r>
+      <w:r>
+        <w:t xml:space="preserve"> on the portal, or made before the Status tab was set up. Add them to the Status tab yourself in the same format (Result: Booked) or straight into the doc.</w:t>
       </w:r>
     </w:p>
     <w:p>
@@ -3358,10 +4677,18 @@
           <w:b/>
           <w:bCs/>
         </w:rPr>
-        <w:t xml:space="preserve">Backup times and rooms: </w:t>
-      </w:r>
-      <w:r>
-        <w:t xml:space="preserve">tried in your order; the next option is already on screen if the first is taken.</w:t>
+        <w:t xml:space="preserve">Cancellations. </w:t>
+      </w:r>
+      <w:r>
+        <w:t xml:space="preserve">When you cancel on the portal, delete or edit your Booked row in the Status tab so the doc stays right.</w:t>
+      </w:r>
+    </w:p>
+    <w:p>
+      <w:pPr>
+        <w:pStyle w:val="Heading1"/>
+      </w:pPr>
+      <w:r>
+        <w:t xml:space="preserve">10. Features at a glance</w:t>
       </w:r>
     </w:p>
     <w:p>
@@ -3378,10 +4705,10 @@
           <w:b/>
           <w:bCs/>
         </w:rPr>
-        <w:t xml:space="preserve">Automatic retries: </w:t>
-      </w:r>
-      <w:r>
-        <w:t xml:space="preserve">keeps trying for 20 minutes if nothing opened at midnight.</w:t>
+        <w:t xml:space="preserve">Midnight mode: </w:t>
+      </w:r>
+      <w:r>
+        <w:t xml:space="preserve">signs in early, prepares up to 6 options, syncs to the portal clock, books within seconds of opening.</w:t>
       </w:r>
     </w:p>
     <w:p>
@@ -3398,10 +4725,10 @@
           <w:b/>
           <w:bCs/>
         </w:rPr>
-        <w:t xml:space="preserve">Shared team plan: </w:t>
-      </w:r>
-      <w:r>
-        <w:t xml:space="preserve">one Google Sheet for the whole group; re-read right before midnight so late changes count.</w:t>
+        <w:t xml:space="preserve">Backup times and rooms: </w:t>
+      </w:r>
+      <w:r>
+        <w:t xml:space="preserve">tried in your order; the next option is already on screen if the first is taken.</w:t>
       </w:r>
     </w:p>
     <w:p>
@@ -3418,10 +4745,10 @@
           <w:b/>
           <w:bCs/>
         </w:rPr>
-        <w:t xml:space="preserve">Status tab: </w:t>
-      </w:r>
-      <w:r>
-        <w:t xml:space="preserve">every result from every person, cloud or computer, in one place.</w:t>
+        <w:t xml:space="preserve">Automatic retries: </w:t>
+      </w:r>
+      <w:r>
+        <w:t xml:space="preserve">keeps trying for 20 minutes if nothing opened at midnight.</w:t>
       </w:r>
     </w:p>
     <w:p>
@@ -3438,10 +4765,10 @@
           <w:b/>
           <w:bCs/>
         </w:rPr>
-        <w:t xml:space="preserve">Cloud or computer: </w:t>
-      </w:r>
-      <w:r>
-        <w:t xml:space="preserve">free GitHub Actions (computer can be off) or a single download.</w:t>
+        <w:t xml:space="preserve">Shared team plan: </w:t>
+      </w:r>
+      <w:r>
+        <w:t xml:space="preserve">one Google Sheet for the whole group; re-read right before midnight so late changes count.</w:t>
       </w:r>
     </w:p>
     <w:p>
@@ -3458,10 +4785,10 @@
           <w:b/>
           <w:bCs/>
         </w:rPr>
-        <w:t xml:space="preserve">Dry runs: </w:t>
-      </w:r>
-      <w:r>
-        <w:t xml:space="preserve">test the whole flow any time without booking anything.</w:t>
+        <w:t xml:space="preserve">Status tab: </w:t>
+      </w:r>
+      <w:r>
+        <w:t xml:space="preserve">every result from every person, cloud or computer, in one place.</w:t>
       </w:r>
     </w:p>
     <w:p>
@@ -3478,10 +4805,10 @@
           <w:b/>
           <w:bCs/>
         </w:rPr>
-        <w:t xml:space="preserve">Book now: </w:t>
-      </w:r>
-      <w:r>
-        <w:t xml:space="preserve">grab whatever is still free on days that are already open.</w:t>
+        <w:t xml:space="preserve">Cloud or computer: </w:t>
+      </w:r>
+      <w:r>
+        <w:t xml:space="preserve">free GitHub Actions (computer can be off) or a single download.</w:t>
       </w:r>
     </w:p>
     <w:p>
@@ -3498,10 +4825,10 @@
           <w:b/>
           <w:bCs/>
         </w:rPr>
-        <w:t xml:space="preserve">Self-updating steps: </w:t>
-      </w:r>
-      <w:r>
-        <w:t xml:space="preserve">the portal's click-by-click steps are downloaded fresh each run, so a fix on GitHub reaches everyone without reinstalling.</w:t>
+        <w:t xml:space="preserve">Dry runs: </w:t>
+      </w:r>
+      <w:r>
+        <w:t xml:space="preserve">test the whole flow any time without booking anything.</w:t>
       </w:r>
     </w:p>
     <w:p>
@@ -3518,18 +4845,10 @@
           <w:b/>
           <w:bCs/>
         </w:rPr>
-        <w:t xml:space="preserve">Safe by default: </w:t>
-      </w:r>
-      <w:r>
-        <w:t xml:space="preserve">new installs start paused; times added late only count from their next occurrence; passwords never leave your account's secrets or your computer.</w:t>
-      </w:r>
-    </w:p>
-    <w:p>
-      <w:pPr>
-        <w:pStyle w:val="Heading1"/>
-      </w:pPr>
-      <w:r>
-        <w:t xml:space="preserve">8. Rules and etiquette</w:t>
+        <w:t xml:space="preserve">Book now: </w:t>
+      </w:r>
+      <w:r>
+        <w:t xml:space="preserve">grab whatever is still free on days that are already open.</w:t>
       </w:r>
     </w:p>
     <w:p>
@@ -3542,17 +4861,14 @@
         <w:spacing w:after="60"/>
       </w:pPr>
       <w:r>
-        <w:t xml:space="preserve">The portal allows </w:t>
-      </w:r>
-      <w:r>
         <w:rPr>
           <w:b/>
           <w:bCs/>
         </w:rPr>
-        <w:t xml:space="preserve">3 hours per person per day</w:t>
-      </w:r>
-      <w:r>
-        <w:t xml:space="preserve">. Plan one row per day per person.</w:t>
+        <w:t xml:space="preserve">Self-updating steps: </w:t>
+      </w:r>
+      <w:r>
+        <w:t xml:space="preserve">the portal's click-by-click steps are downloaded fresh each run, so a fix on GitHub reaches everyone without reinstalling.</w:t>
       </w:r>
     </w:p>
     <w:p>
@@ -3569,10 +4885,18 @@
           <w:b/>
           <w:bCs/>
         </w:rPr>
-        <w:t xml:space="preserve">Cancel bookings you won't use</w:t>
-      </w:r>
-      <w:r>
-        <w:t xml:space="preserve"> on the portal. Unused rooms block other students, and the portal shows who booked them.</w:t>
+        <w:t xml:space="preserve">Safe by default: </w:t>
+      </w:r>
+      <w:r>
+        <w:t xml:space="preserve">new installs start paused; times added late only count from their next occurrence; passwords never leave your account's secrets or your computer.</w:t>
+      </w:r>
+    </w:p>
+    <w:p>
+      <w:pPr>
+        <w:pStyle w:val="Heading1"/>
+      </w:pPr>
+      <w:r>
+        <w:t xml:space="preserve">11. Rules and etiquette</w:t>
       </w:r>
     </w:p>
     <w:p>
@@ -3585,17 +4909,17 @@
         <w:spacing w:after="60"/>
       </w:pPr>
       <w:r>
-        <w:t xml:space="preserve">Use </w:t>
+        <w:t xml:space="preserve">The portal allows </w:t>
       </w:r>
       <w:r>
         <w:rPr>
           <w:b/>
           <w:bCs/>
         </w:rPr>
-        <w:t xml:space="preserve">one</w:t>
-      </w:r>
-      <w:r>
-        <w:t xml:space="preserve"> option (cloud or computer) per account, not both.</w:t>
+        <w:t xml:space="preserve">3 hours per person per day</w:t>
+      </w:r>
+      <w:r>
+        <w:t xml:space="preserve">. Plan one row per day per person.</w:t>
       </w:r>
     </w:p>
     <w:p>
@@ -3608,7 +4932,14 @@
         <w:spacing w:after="60"/>
       </w:pPr>
       <w:r>
-        <w:t xml:space="preserve">GitHub's terms describe Actions as being for building and testing software, so GitHub could switch off a workflow used like this. If that happens, use Option B.</w:t>
+        <w:rPr>
+          <w:b/>
+          <w:bCs/>
+        </w:rPr>
+        <w:t xml:space="preserve">Cancel bookings you won't use</w:t>
+      </w:r>
+      <w:r>
+        <w:t xml:space="preserve"> on the portal. Unused rooms block other students, and the portal shows who booked them.</w:t>
       </w:r>
     </w:p>
     <w:p>
@@ -3621,6 +4952,42 @@
         <w:spacing w:after="60"/>
       </w:pPr>
       <w:r>
+        <w:t xml:space="preserve">Use </w:t>
+      </w:r>
+      <w:r>
+        <w:rPr>
+          <w:b/>
+          <w:bCs/>
+        </w:rPr>
+        <w:t xml:space="preserve">one</w:t>
+      </w:r>
+      <w:r>
+        <w:t xml:space="preserve"> option (cloud or computer) per account, not both.</w:t>
+      </w:r>
+    </w:p>
+    <w:p>
+      <w:pPr>
+        <w:pStyle w:val="ListParagraph"/>
+        <w:numPr>
+          <w:ilvl w:val="0"/>
+          <w:numId w:val="5"/>
+        </w:numPr>
+        <w:spacing w:after="60"/>
+      </w:pPr>
+      <w:r>
+        <w:t xml:space="preserve">GitHub's terms describe Actions as being for building and testing software, so GitHub could switch off a workflow used like this. If that happens, use Option B.</w:t>
+      </w:r>
+    </w:p>
+    <w:p>
+      <w:pPr>
+        <w:pStyle w:val="ListParagraph"/>
+        <w:numPr>
+          <w:ilvl w:val="0"/>
+          <w:numId w:val="5"/>
+        </w:numPr>
+        <w:spacing w:after="60"/>
+      </w:pPr>
+      <w:r>
         <w:t xml:space="preserve">GitHub pauses scheduled runs in a repo with no activity for 60 days. If you get that email, click the link to turn it back on.</w:t>
       </w:r>
     </w:p>
@@ -3629,7 +4996,7 @@
         <w:pStyle w:val="Heading1"/>
       </w:pPr>
       <w:r>
-        <w:t xml:space="preserve">9. Troubleshooting</w:t>
+        <w:t xml:space="preserve">12. Troubleshooting</w:t>
       </w:r>
     </w:p>
     <w:tbl>
@@ -3991,7 +5358,7 @@
         <w:pStyle w:val="Heading1"/>
       </w:pPr>
       <w:r>
-        <w:t xml:space="preserve">10. For the organizer</w:t>
+        <w:t xml:space="preserve">13. For the organizer</w:t>
       </w:r>
     </w:p>
     <w:p>
@@ -4540,6 +5907,12 @@
   </w:num>
   <w:num w:numId="5">
     <w:abstractNumId w:val="2"/>
+    <w:lvlOverride w:ilvl="0">
+      <w:startOverride w:val="1"/>
+    </w:lvlOverride>
+  </w:num>
+  <w:num w:numId="6">
+    <w:abstractNumId w:val="6"/>
     <w:lvlOverride w:ilvl="0">
       <w:startOverride w:val="1"/>
     </w:lvlOverride>

</xml_diff>

<commit_message>
Team sheet: dropdowns, and rooms per day
- sheet/Code.gs: "Set up dropdowns" (also in a new Canal Booker menu and
  in setup) turns the plan tab into Name, Username, Day, Start, End,
  Backup 1, Backup 2, Room 1-3 with dropdowns for everything but name
  and username (half-hour times, 1 to 3 hour backup ranges, the five
  rooms). An older plan's typed lists are converted, keeping every value.
  Safe to run again. The Setup guide tab text matches.
- Parser reads both layouts (Backup 1/2 or Backup times, Room 1-3 or
  Rooms (in order)) and keeps rooms per row, so each day can have its
  own room order; rows without rooms use the person's first rooms.
- booker uses the day's rooms; a ROOMS override still wins. The app's
  import keeps each slot's rooms.
- README and the guide describe the dropdown columns.

Co-Authored-By: Claude Opus 5.5 <noreply@anthropic.com>
Claude-Session: https://claude.ai/code/session_013Zbb6i1rwwoij3EYkDMqKx
</commit_message>
<xml_diff>
--- a/docs/Canal-Booker-Guide.docx
+++ b/docs/Canal-Booker-Guide.docx
@@ -95,7 +95,7 @@
             <w:r>
               <w:t xml:space="preserve">add your rows to the </w:t>
             </w:r>
-            <w:hyperlink w:history="1" r:id="rIdk1a7mjewuzhkhf-injakw">
+            <w:hyperlink w:history="1" r:id="rId2z31ckpiyqntlj2sxmzgn">
               <w:r>
                 <w:rPr>
                   <w:rStyle w:val="Hyperlink"/>
@@ -283,7 +283,7 @@
             </w:tcMar>
           </w:tcPr>
           <w:p>
-            <w:hyperlink w:history="1" r:id="rIds-a9crzcutnfnc7n6mvqk">
+            <w:hyperlink w:history="1" r:id="rIdrzt5ck_iavgrolmm1cjo3">
               <w:r>
                 <w:rPr>
                   <w:rStyle w:val="Hyperlink"/>
@@ -391,7 +391,7 @@
             </w:tcMar>
           </w:tcPr>
           <w:p>
-            <w:hyperlink w:history="1" r:id="rIda1vmu-rktuqzt-mn04dvm">
+            <w:hyperlink w:history="1" r:id="rIddbhfqsbwxjuzpx4yxwsjc">
               <w:r>
                 <w:rPr>
                   <w:rStyle w:val="Hyperlink"/>
@@ -449,7 +449,7 @@
             </w:tcMar>
           </w:tcPr>
           <w:p>
-            <w:hyperlink w:history="1" r:id="rIdh83upuzcpylpj7tztwbon">
+            <w:hyperlink w:history="1" r:id="rId_cldafgnglk2p5l0hogpc">
               <w:r>
                 <w:rPr>
                   <w:rStyle w:val="Hyperlink"/>
@@ -507,7 +507,7 @@
             </w:tcMar>
           </w:tcPr>
           <w:p>
-            <w:hyperlink w:history="1" r:id="rIdzisfopi0eycqbigjoqdu0">
+            <w:hyperlink w:history="1" r:id="rIdshwnivlhftdi6bw4e1tlm">
               <w:r>
                 <w:rPr>
                   <w:rStyle w:val="Hyperlink"/>
@@ -615,7 +615,7 @@
             </w:tcMar>
           </w:tcPr>
           <w:p>
-            <w:hyperlink w:history="1" r:id="rIdzmn0tavj2nkmxzgxqizab">
+            <w:hyperlink w:history="1" r:id="rId9syuutvcrzuctdelfzdfq">
               <w:r>
                 <w:rPr>
                   <w:rStyle w:val="Hyperlink"/>
@@ -814,7 +814,7 @@
       <w:r>
         <w:t xml:space="preserve">Open the </w:t>
       </w:r>
-      <w:hyperlink w:history="1" r:id="rIdhxmcfv2gsvbrpayr-lm5-">
+      <w:hyperlink w:history="1" r:id="rIde-plvkzgsjtmbalankyqc">
         <w:r>
           <w:rPr>
             <w:rStyle w:val="Hyperlink"/>
@@ -833,7 +833,7 @@
         <w:t xml:space="preserve">one row per day</w:t>
       </w:r>
       <w:r>
-        <w:t xml:space="preserve"> you want a room. Don't rename the header row.</w:t>
+        <w:t xml:space="preserve"> you want a room. Type your name and username; everything else is a dropdown. Don't rename the header row.</w:t>
       </w:r>
     </w:p>
     <w:tbl>
@@ -987,7 +987,7 @@
           </w:tcPr>
           <w:p>
             <w:r>
-              <w:t xml:space="preserve">Your name (shown in the Status tab)</w:t>
+              <w:t xml:space="preserve">Type it. Shown in the Status tab</w:t>
             </w:r>
           </w:p>
         </w:tc>
@@ -1059,7 +1059,7 @@
           </w:tcPr>
           <w:p>
             <w:r>
-              <w:t xml:space="preserve">Your MyCarletonOne username, the part before @carleton.ca</w:t>
+              <w:t xml:space="preserve">Type it. Your MyCarletonOne username, the part before @carleton.ca</w:t>
             </w:r>
           </w:p>
         </w:tc>
@@ -1131,7 +1131,7 @@
           </w:tcPr>
           <w:p>
             <w:r>
-              <w:t xml:space="preserve">Mon, Tue, Wed, Thu, Fri, Sat or Sun</w:t>
+              <w:t xml:space="preserve">Dropdown: Mon to Sun</w:t>
             </w:r>
           </w:p>
         </w:tc>
@@ -1181,7 +1181,7 @@
                 <w:b/>
                 <w:bCs/>
               </w:rPr>
-              <w:t xml:space="preserve">Start</w:t>
+              <w:t xml:space="preserve">Start / End</w:t>
             </w:r>
           </w:p>
         </w:tc>
@@ -1203,7 +1203,7 @@
           </w:tcPr>
           <w:p>
             <w:r>
-              <w:t xml:space="preserve">24-hour time</w:t>
+              <w:t xml:space="preserve">Dropdowns, every half hour. At most 3 hours apart</w:t>
             </w:r>
           </w:p>
         </w:tc>
@@ -1225,7 +1225,7 @@
           </w:tcPr>
           <w:p>
             <w:r>
-              <w:t xml:space="preserve">12:00</w:t>
+              <w:t xml:space="preserve">12:00 / 15:00</w:t>
             </w:r>
           </w:p>
         </w:tc>
@@ -1253,7 +1253,7 @@
                 <w:b/>
                 <w:bCs/>
               </w:rPr>
-              <w:t xml:space="preserve">End</w:t>
+              <w:t xml:space="preserve">Backup 1 / Backup 2</w:t>
             </w:r>
           </w:p>
         </w:tc>
@@ -1275,7 +1275,7 @@
           </w:tcPr>
           <w:p>
             <w:r>
-              <w:t xml:space="preserve">24-hour time, at most 3 hours after Start</w:t>
+              <w:t xml:space="preserve">Optional dropdowns. Tried in order if the main time is taken</w:t>
             </w:r>
           </w:p>
         </w:tc>
@@ -1297,7 +1297,7 @@
           </w:tcPr>
           <w:p>
             <w:r>
-              <w:t xml:space="preserve">15:00</w:t>
+              <w:t xml:space="preserve">09:00-12:00 / 15:00-18:00</w:t>
             </w:r>
           </w:p>
         </w:tc>
@@ -1325,7 +1325,7 @@
                 <w:b/>
                 <w:bCs/>
               </w:rPr>
-              <w:t xml:space="preserve">Backup times</w:t>
+              <w:t xml:space="preserve">Room 1 / 2 / 3</w:t>
             </w:r>
           </w:p>
         </w:tc>
@@ -1347,7 +1347,7 @@
           </w:tcPr>
           <w:p>
             <w:r>
-              <w:t xml:space="preserve">Optional. Tried in order if the main time is taken</w:t>
+              <w:t xml:space="preserve">Optional dropdowns. That day's rooms in order. Every time is tried in Room 1 before Room 2. Blank = your other rows' rooms</w:t>
             </w:r>
           </w:p>
         </w:tc>
@@ -1369,79 +1369,7 @@
           </w:tcPr>
           <w:p>
             <w:r>
-              <w:t xml:space="preserve">09:00-12:00, 15:00-18:00</w:t>
-            </w:r>
-          </w:p>
-        </w:tc>
-      </w:tr>
-      <w:tr>
-        <w:tc>
-          <w:tcPr>
-            <w:tcW w:type="dxa" w:w="2000"/>
-            <w:tcBorders>
-              <w:top w:val="single" w:color="B4C6DC" w:sz="4"/>
-              <w:left w:val="single" w:color="B4C6DC" w:sz="4"/>
-              <w:bottom w:val="single" w:color="B4C6DC" w:sz="4"/>
-              <w:right w:val="single" w:color="B4C6DC" w:sz="4"/>
-            </w:tcBorders>
-            <w:tcMar>
-              <w:top w:type="dxa" w:w="80"/>
-              <w:left w:type="dxa" w:w="120"/>
-              <w:bottom w:type="dxa" w:w="80"/>
-              <w:right w:type="dxa" w:w="120"/>
-            </w:tcMar>
-          </w:tcPr>
-          <w:p>
-            <w:r>
-              <w:rPr>
-                <w:b/>
-                <w:bCs/>
-              </w:rPr>
-              <w:t xml:space="preserve">Rooms (in order)</w:t>
-            </w:r>
-          </w:p>
-        </w:tc>
-        <w:tc>
-          <w:tcPr>
-            <w:tcW w:type="dxa" w:w="3280"/>
-            <w:tcBorders>
-              <w:top w:val="single" w:color="B4C6DC" w:sz="4"/>
-              <w:left w:val="single" w:color="B4C6DC" w:sz="4"/>
-              <w:bottom w:val="single" w:color="B4C6DC" w:sz="4"/>
-              <w:right w:val="single" w:color="B4C6DC" w:sz="4"/>
-            </w:tcBorders>
-            <w:tcMar>
-              <w:top w:type="dxa" w:w="80"/>
-              <w:left w:type="dxa" w:w="120"/>
-              <w:bottom w:type="dxa" w:w="80"/>
-              <w:right w:type="dxa" w:w="120"/>
-            </w:tcMar>
-          </w:tcPr>
-          <w:p>
-            <w:r>
-              <w:t xml:space="preserve">Optional. Rooms in order of preference</w:t>
-            </w:r>
-          </w:p>
-        </w:tc>
-        <w:tc>
-          <w:tcPr>
-            <w:tcW w:type="dxa" w:w="4080"/>
-            <w:tcBorders>
-              <w:top w:val="single" w:color="B4C6DC" w:sz="4"/>
-              <w:left w:val="single" w:color="B4C6DC" w:sz="4"/>
-              <w:bottom w:val="single" w:color="B4C6DC" w:sz="4"/>
-              <w:right w:val="single" w:color="B4C6DC" w:sz="4"/>
-            </w:tcBorders>
-            <w:tcMar>
-              <w:top w:type="dxa" w:w="80"/>
-              <w:left w:type="dxa" w:w="120"/>
-              <w:bottom w:type="dxa" w:w="80"/>
-              <w:right w:type="dxa" w:w="120"/>
-            </w:tcMar>
-          </w:tcPr>
-          <w:p>
-            <w:r>
-              <w:t xml:space="preserve">CB 2103, CB 2302</w:t>
+              <w:t xml:space="preserve">CB 2302 / CB 2103</w:t>
             </w:r>
           </w:p>
         </w:tc>
@@ -1467,7 +1395,7 @@
         <w:t xml:space="preserve">CB 2103, CB 2302, CB 3102, CB 3201, CB 3208</w:t>
       </w:r>
       <w:r>
-        <w:t xml:space="preserve">. Changes count from the next night's run, and the bot re-reads the sheet right before midnight, so late edits still count.</w:t>
+        <w:t xml:space="preserve">. Each row has its own rooms, so you can put a different room first on different days. The bot re-reads the sheet about 2½ minutes before midnight, so edits made before about 11:55 pm count that night.</w:t>
       </w:r>
     </w:p>
     <w:p>
@@ -2153,7 +2081,7 @@
       <w:r>
         <w:t xml:space="preserve">Open </w:t>
       </w:r>
-      <w:hyperlink w:history="1" r:id="rId8vsvdjsfgi9fibru-k6qw">
+      <w:hyperlink w:history="1" r:id="rIdcidoiymjqwhj4wnjptbrl">
         <w:r>
           <w:rPr>
             <w:rStyle w:val="Hyperlink"/>
@@ -2378,7 +2306,7 @@
       <w:r>
         <w:t xml:space="preserve">Go to </w:t>
       </w:r>
-      <w:hyperlink w:history="1" r:id="rIdhonylzcjgzcfxosxak0hv">
+      <w:hyperlink w:history="1" r:id="rIdvup2b8eh3dafrme9e_ayx">
         <w:r>
           <w:rPr>
             <w:rStyle w:val="Hyperlink"/>
@@ -2971,7 +2899,7 @@
       <w:r>
         <w:t xml:space="preserve">The portal's </w:t>
       </w:r>
-      <w:hyperlink w:history="1" r:id="rIdqh-1zwdt0aadnzm5czpps">
+      <w:hyperlink w:history="1" r:id="rIdklwyzj2h-bjovpjcdzcyt">
         <w:r>
           <w:rPr>
             <w:rStyle w:val="Hyperlink"/>
@@ -4725,7 +4653,7 @@
           <w:b/>
           <w:bCs/>
         </w:rPr>
-        <w:t xml:space="preserve">Backup times and rooms: </w:t>
+        <w:t xml:space="preserve">Dropdowns, backup times and rooms per day: </w:t>
       </w:r>
       <w:r>
         <w:t xml:space="preserve">tried in your order; the next option is already on screen if the first is taken.</w:t>

</xml_diff>

<commit_message>
Every copy runs the newest code; sheet in Ottawa time
- book.yml: check out the code from silix54/canal-booker (its main
  branch) instead of the fork's own files, so fixes reach everyone's
  copy without "Sync fork". Each copy still uses its own secrets. The
  main repo checks out the branch that was run, so branches can still be
  tested. Copies made before this need one last sync to pick it up.
- Code.gs: setupDropdowns (and setup) set the sheet's time zone to
  America/Toronto; new sheets default to Pacific, which made the Status
  tab's "When (Ottawa)" times 3 hours early.
- README, the Setup guide tab and the Word guide say updates are
  automatic and how older copies switch it on.

Co-Authored-By: Claude Opus 5.5 <noreply@anthropic.com>
Claude-Session: https://claude.ai/code/session_013Zbb6i1rwwoij3EYkDMqKx
</commit_message>
<xml_diff>
--- a/docs/Canal-Booker-Guide.docx
+++ b/docs/Canal-Booker-Guide.docx
@@ -95,7 +95,7 @@
             <w:r>
               <w:t xml:space="preserve">add your rows to the </w:t>
             </w:r>
-            <w:hyperlink w:history="1" r:id="rId2z31ckpiyqntlj2sxmzgn">
+            <w:hyperlink w:history="1" r:id="rIdz-8qqhvmzv8q65r9jp1mj">
               <w:r>
                 <w:rPr>
                   <w:rStyle w:val="Hyperlink"/>
@@ -283,7 +283,7 @@
             </w:tcMar>
           </w:tcPr>
           <w:p>
-            <w:hyperlink w:history="1" r:id="rIdrzt5ck_iavgrolmm1cjo3">
+            <w:hyperlink w:history="1" r:id="rIdvociejxwvwvggyuktsw1c">
               <w:r>
                 <w:rPr>
                   <w:rStyle w:val="Hyperlink"/>
@@ -391,7 +391,7 @@
             </w:tcMar>
           </w:tcPr>
           <w:p>
-            <w:hyperlink w:history="1" r:id="rIddbhfqsbwxjuzpx4yxwsjc">
+            <w:hyperlink w:history="1" r:id="rIdgs-dgooilafmk0l9hcltl">
               <w:r>
                 <w:rPr>
                   <w:rStyle w:val="Hyperlink"/>
@@ -449,7 +449,7 @@
             </w:tcMar>
           </w:tcPr>
           <w:p>
-            <w:hyperlink w:history="1" r:id="rId_cldafgnglk2p5l0hogpc">
+            <w:hyperlink w:history="1" r:id="rIddhrzrggpixtpkngzisoee">
               <w:r>
                 <w:rPr>
                   <w:rStyle w:val="Hyperlink"/>
@@ -507,7 +507,7 @@
             </w:tcMar>
           </w:tcPr>
           <w:p>
-            <w:hyperlink w:history="1" r:id="rIdshwnivlhftdi6bw4e1tlm">
+            <w:hyperlink w:history="1" r:id="rIdkmldqkvplahgrhbg9em6m">
               <w:r>
                 <w:rPr>
                   <w:rStyle w:val="Hyperlink"/>
@@ -615,7 +615,7 @@
             </w:tcMar>
           </w:tcPr>
           <w:p>
-            <w:hyperlink w:history="1" r:id="rId9syuutvcrzuctdelfzdfq">
+            <w:hyperlink w:history="1" r:id="rIdy-yflgc9ifsulqv84zn4c">
               <w:r>
                 <w:rPr>
                   <w:rStyle w:val="Hyperlink"/>
@@ -814,7 +814,7 @@
       <w:r>
         <w:t xml:space="preserve">Open the </w:t>
       </w:r>
-      <w:hyperlink w:history="1" r:id="rIde-plvkzgsjtmbalankyqc">
+      <w:hyperlink w:history="1" r:id="rIdyff5vfhruiebu8uldmsmi">
         <w:r>
           <w:rPr>
             <w:rStyle w:val="Hyperlink"/>
@@ -2081,7 +2081,7 @@
       <w:r>
         <w:t xml:space="preserve">Open </w:t>
       </w:r>
-      <w:hyperlink w:history="1" r:id="rIdcidoiymjqwhj4wnjptbrl">
+      <w:hyperlink w:history="1" r:id="rIdtsix4uy4lhhnuxcdupal_">
         <w:r>
           <w:rPr>
             <w:rStyle w:val="Hyperlink"/>
@@ -2249,21 +2249,31 @@
         <w:spacing w:after="60"/>
       </w:pPr>
       <w:r>
-        <w:t xml:space="preserve">Done. It runs every night by itself.</w:t>
-      </w:r>
-    </w:p>
-    <w:p>
-      <w:pPr>
-        <w:spacing w:after="120"/>
-      </w:pPr>
-      <w:r>
-        <w:t xml:space="preserve">When it runs: GitHub can start scheduled jobs hours late, so the workflow starts five times a night, about one hour apart from roughly </w:t>
+        <w:t xml:space="preserve">Done. It runs every night by itself, and </w:t>
       </w:r>
       <w:r>
         <w:rPr>
           <w:b/>
           <w:bCs/>
         </w:rPr>
+        <w:t xml:space="preserve">updates itself</w:t>
+      </w:r>
+      <w:r>
+        <w:t xml:space="preserve">: your copy always runs the newest code from the main repo, so you never need to sync it.</w:t>
+      </w:r>
+    </w:p>
+    <w:p>
+      <w:pPr>
+        <w:spacing w:after="120"/>
+      </w:pPr>
+      <w:r>
+        <w:t xml:space="preserve">When it runs: GitHub can start scheduled jobs hours late, so the workflow starts five times a night, about one hour apart from roughly </w:t>
+      </w:r>
+      <w:r>
+        <w:rPr>
+          <w:b/>
+          <w:bCs/>
+        </w:rPr>
         <w:t xml:space="preserve">7:17 pm</w:t>
       </w:r>
       <w:r>
@@ -2277,6 +2287,69 @@
       <w:r>
         <w:t xml:space="preserve">Exact start time (optional): the README on GitHub explains how to use a free timer at cron-job.org to start the run at exactly 11:40 pm instead of relying on GitHub's schedule.</w:t>
       </w:r>
+    </w:p>
+    <w:tbl>
+      <w:tblPr>
+        <w:tblW w:type="dxa" w:w="9360"/>
+        <w:tblBorders>
+          <w:top w:val="single" w:color="auto" w:sz="4"/>
+          <w:left w:val="single" w:color="auto" w:sz="4"/>
+          <w:bottom w:val="single" w:color="auto" w:sz="4"/>
+          <w:right w:val="single" w:color="auto" w:sz="4"/>
+          <w:insideH w:val="single" w:color="auto" w:sz="4"/>
+          <w:insideV w:val="single" w:color="auto" w:sz="4"/>
+        </w:tblBorders>
+      </w:tblPr>
+      <w:tblGrid>
+        <w:gridCol w:w="9360"/>
+      </w:tblGrid>
+      <w:tr>
+        <w:tc>
+          <w:tcPr>
+            <w:tcW w:type="dxa" w:w="9360"/>
+            <w:tcBorders>
+              <w:top w:val="none" w:color="FFFFFF" w:sz="0"/>
+              <w:left w:val="single" w:color="1F4E79" w:sz="24"/>
+              <w:bottom w:val="none" w:color="FFFFFF" w:sz="0"/>
+              <w:right w:val="none" w:color="FFFFFF" w:sz="0"/>
+            </w:tcBorders>
+            <w:shd w:fill="DCE6F1" w:color="auto" w:val="clear"/>
+            <w:tcMar>
+              <w:top w:type="dxa" w:w="120"/>
+              <w:left w:type="dxa" w:w="200"/>
+              <w:bottom w:type="dxa" w:w="120"/>
+              <w:right w:type="dxa" w:w="200"/>
+            </w:tcMar>
+          </w:tcPr>
+          <w:p>
+            <w:r>
+              <w:rPr>
+                <w:b/>
+                <w:bCs/>
+              </w:rPr>
+              <w:t xml:space="preserve">Copy made before Oct 6, 2026? </w:t>
+            </w:r>
+            <w:r>
+              <w:t xml:space="preserve">Do this once: open your copy on GitHub and click </w:t>
+            </w:r>
+            <w:r>
+              <w:rPr>
+                <w:b/>
+                <w:bCs/>
+              </w:rPr>
+              <w:t xml:space="preserve">Sync fork → Update branch</w:t>
+            </w:r>
+            <w:r>
+              <w:t xml:space="preserve">. From then on updates arrive by themselves.</w:t>
+            </w:r>
+          </w:p>
+        </w:tc>
+      </w:tr>
+    </w:tbl>
+    <w:p>
+      <w:pPr>
+        <w:spacing w:after="60"/>
+      </w:pPr>
     </w:p>
     <w:p>
       <w:pPr>
@@ -2306,7 +2379,7 @@
       <w:r>
         <w:t xml:space="preserve">Go to </w:t>
       </w:r>
-      <w:hyperlink w:history="1" r:id="rIdvup2b8eh3dafrme9e_ayx">
+      <w:hyperlink w:history="1" r:id="rIdgx6lan8em_bkvpfqbtdp3">
         <w:r>
           <w:rPr>
             <w:rStyle w:val="Hyperlink"/>
@@ -2899,7 +2972,7 @@
       <w:r>
         <w:t xml:space="preserve">The portal's </w:t>
       </w:r>
-      <w:hyperlink w:history="1" r:id="rIdklwyzj2h-bjovpjcdzcyt">
+      <w:hyperlink w:history="1" r:id="rIdzuud6dutjzwmwhsy4svem">
         <w:r>
           <w:rPr>
             <w:rStyle w:val="Hyperlink"/>
@@ -5389,6 +5462,46 @@
       </w:r>
       <w:r>
         <w:t xml:space="preserve"> in the main repo holds the sheet link, the status link and where the booking steps come from. Forks read it from the main repo, so they don't need to sync.</w:t>
+      </w:r>
+    </w:p>
+    <w:p>
+      <w:pPr>
+        <w:pStyle w:val="ListParagraph"/>
+        <w:numPr>
+          <w:ilvl w:val="0"/>
+          <w:numId w:val="5"/>
+        </w:numPr>
+        <w:spacing w:after="60"/>
+      </w:pPr>
+      <w:r>
+        <w:rPr>
+          <w:b/>
+          <w:bCs/>
+        </w:rPr>
+        <w:t xml:space="preserve">Updates reach everyone: </w:t>
+      </w:r>
+      <w:r>
+        <w:t xml:space="preserve">every copy's nightly run checks out the newest code from the main repo's main branch, so merging a fix there is enough. Copies made before Oct 6, 2026 need one Sync fork first.</w:t>
+      </w:r>
+    </w:p>
+    <w:p>
+      <w:pPr>
+        <w:pStyle w:val="ListParagraph"/>
+        <w:numPr>
+          <w:ilvl w:val="0"/>
+          <w:numId w:val="5"/>
+        </w:numPr>
+        <w:spacing w:after="60"/>
+      </w:pPr>
+      <w:r>
+        <w:rPr>
+          <w:b/>
+          <w:bCs/>
+        </w:rPr>
+        <w:t xml:space="preserve">Sheet time zone: </w:t>
+      </w:r>
+      <w:r>
+        <w:t xml:space="preserve">the sheet script sets the sheet to Ottawa time (File → Settings shows Eastern Time - Toronto), so the Status tab's times are right.</w:t>
       </w:r>
     </w:p>
     <w:p>

</xml_diff>